<commit_message>
Import firearm data and filter retired talent maxima
</commit_message>
<xml_diff>
--- a/thoughts.docx
+++ b/thoughts.docx
@@ -3,502 +3,314 @@
 <w:document xmlns:wpc="http://schemas.microsoft.com/office/word/2010/wordprocessingCanvas" xmlns:cx="http://schemas.microsoft.com/office/drawing/2014/chartex" xmlns:cx1="http://schemas.microsoft.com/office/drawing/2015/9/8/chartex" xmlns:cx2="http://schemas.microsoft.com/office/drawing/2015/10/21/chartex" xmlns:cx3="http://schemas.microsoft.com/office/drawing/2016/5/9/chartex" xmlns:cx4="http://schemas.microsoft.com/office/drawing/2016/5/10/chartex" xmlns:cx5="http://schemas.microsoft.com/office/drawing/2016/5/11/chartex" xmlns:cx6="http://schemas.microsoft.com/office/drawing/2016/5/12/chartex" xmlns:cx7="http://schemas.microsoft.com/office/drawing/2016/5/13/chartex" xmlns:cx8="http://schemas.microsoft.com/office/drawing/2016/5/14/chartex" xmlns:mc="http://schemas.openxmlformats.org/markup-compatibility/2006" xmlns:aink="http://schemas.microsoft.com/office/drawing/2016/ink" xmlns:am3d="http://schemas.microsoft.com/office/drawing/2017/model3d" xmlns:o="urn:schemas-microsoft-com:office:office" xmlns:oel="http://schemas.microsoft.com/office/2019/extlst" xmlns:r="http://schemas.openxmlformats.org/officeDocument/2006/relationships" xmlns:m="http://schemas.openxmlformats.org/officeDocument/2006/math" xmlns:v="urn:schemas-microsoft-com:vml" xmlns:wp14="http://schemas.microsoft.com/office/word/2010/wordprocessingDrawing" xmlns:wp="http://schemas.openxmlformats.org/drawingml/2006/wordprocessingDrawing" xmlns:w10="urn:schemas-microsoft-com:office:word" xmlns:w="http://schemas.openxmlformats.org/wordprocessingml/2006/main" xmlns:w14="http://schemas.microsoft.com/office/word/2010/wordml" xmlns:w15="http://schemas.microsoft.com/office/word/2012/wordml" xmlns:w16cex="http://schemas.microsoft.com/office/word/2018/wordml/cex" xmlns:w16cid="http://schemas.microsoft.com/office/word/2016/wordml/cid" xmlns:w16="http://schemas.microsoft.com/office/word/2018/wordml" xmlns:w16sdtdh="http://schemas.microsoft.com/office/word/2020/wordml/sdtdatahash" xmlns:w16se="http://schemas.microsoft.com/office/word/2015/wordml/symex" xmlns:wpg="http://schemas.microsoft.com/office/word/2010/wordprocessingGroup" xmlns:wpi="http://schemas.microsoft.com/office/word/2010/wordprocessingInk" xmlns:wne="http://schemas.microsoft.com/office/word/2006/wordml" xmlns:wps="http://schemas.microsoft.com/office/word/2010/wordprocessingShape" mc:Ignorable="w14 w15 w16se w16cid w16 w16cex w16sdtdh wp14">
   <w:body>
     <w:p>
-      <w:r>
-        <w:br/>
-      </w:r>
-      <w:r>
-        <w:t xml:space="preserve">vor- und </w:t>
-      </w:r>
-      <w:proofErr w:type="spellStart"/>
-      <w:r>
-        <w:t>nachteile</w:t>
-      </w:r>
-      <w:proofErr w:type="spellEnd"/>
-      <w:r>
-        <w:t xml:space="preserve">: </w:t>
-      </w:r>
-      <w:proofErr w:type="spellStart"/>
-      <w:r>
-        <w:t>referenzen</w:t>
-      </w:r>
-      <w:proofErr w:type="spellEnd"/>
-      <w:r>
-        <w:t xml:space="preserve"> überarbeite</w:t>
-      </w:r>
-      <w:r>
-        <w:t xml:space="preserve">n für </w:t>
-      </w:r>
-      <w:proofErr w:type="spellStart"/>
-      <w:r>
-        <w:t>ängste</w:t>
-      </w:r>
-      <w:proofErr w:type="spellEnd"/>
-      <w:r>
-        <w:t xml:space="preserve"> und </w:t>
-      </w:r>
-      <w:proofErr w:type="spellStart"/>
-      <w:r>
-        <w:t>anfälligkeiten</w:t>
-      </w:r>
-      <w:proofErr w:type="spellEnd"/>
-      <w:r>
-        <w:t>. Nur 1 pick pro gruppe</w:t>
-      </w:r>
-      <w:r>
-        <w:br/>
-      </w:r>
-      <w:r>
-        <w:br/>
-      </w:r>
-      <w:r>
-        <w:br/>
-      </w:r>
-      <w:r>
-        <w:t xml:space="preserve">verhalten von </w:t>
-      </w:r>
-      <w:proofErr w:type="spellStart"/>
-      <w:r>
-        <w:t>taw</w:t>
-      </w:r>
-      <w:proofErr w:type="spellEnd"/>
-      <w:r>
-        <w:t xml:space="preserve"> mit </w:t>
-      </w:r>
-      <w:proofErr w:type="spellStart"/>
-      <w:r>
-        <w:t>spezialisierungen</w:t>
-      </w:r>
-      <w:proofErr w:type="spellEnd"/>
-      <w:r>
-        <w:t xml:space="preserve">: </w:t>
-      </w:r>
-      <w:r>
-        <w:br/>
-        <w:t xml:space="preserve">in der </w:t>
-      </w:r>
-      <w:proofErr w:type="spellStart"/>
-      <w:r>
-        <w:t>hauptfertigkeit</w:t>
-      </w:r>
-      <w:proofErr w:type="spellEnd"/>
-      <w:r>
-        <w:t xml:space="preserve"> modifizierbares </w:t>
-      </w:r>
-      <w:proofErr w:type="spellStart"/>
-      <w:r>
-        <w:t>wertfeld</w:t>
-      </w:r>
-      <w:proofErr w:type="spellEnd"/>
-      <w:r>
-        <w:t xml:space="preserve">. Spezialisierungen können angezeigt werden, aber </w:t>
-      </w:r>
-      <w:r>
-        <w:t xml:space="preserve">erst wenn </w:t>
-      </w:r>
-      <w:proofErr w:type="spellStart"/>
-      <w:r>
-        <w:t>taw</w:t>
-      </w:r>
-      <w:proofErr w:type="spellEnd"/>
-      <w:r>
-        <w:t xml:space="preserve"> &gt;0 die </w:t>
-      </w:r>
-      <w:proofErr w:type="spellStart"/>
-      <w:r>
-        <w:t>spezialisierungen</w:t>
-      </w:r>
-      <w:proofErr w:type="spellEnd"/>
-      <w:r>
-        <w:t xml:space="preserve"> anbieten. </w:t>
-      </w:r>
-      <w:r>
-        <w:br/>
-      </w:r>
-      <w:proofErr w:type="spellStart"/>
-      <w:r>
-        <w:t>regel</w:t>
-      </w:r>
-      <w:proofErr w:type="spellEnd"/>
-      <w:r>
-        <w:t xml:space="preserve">: </w:t>
-      </w:r>
-      <w:proofErr w:type="spellStart"/>
-      <w:r>
-        <w:t>spezialisierung</w:t>
-      </w:r>
-      <w:proofErr w:type="spellEnd"/>
-      <w:r>
-        <w:t xml:space="preserve"> maximal so hoch wie der </w:t>
-      </w:r>
-      <w:proofErr w:type="spellStart"/>
-      <w:r>
-        <w:t>taw</w:t>
-      </w:r>
-      <w:proofErr w:type="spellEnd"/>
-      <w:r>
-        <w:br/>
-      </w:r>
-      <w:proofErr w:type="spellStart"/>
-      <w:r>
-        <w:t>fehler</w:t>
-      </w:r>
-      <w:proofErr w:type="spellEnd"/>
-      <w:r>
-        <w:t xml:space="preserve">: bei </w:t>
-      </w:r>
-      <w:proofErr w:type="spellStart"/>
-      <w:r>
-        <w:t>werteingabe</w:t>
-      </w:r>
-      <w:proofErr w:type="spellEnd"/>
-      <w:r>
-        <w:t xml:space="preserve"> in </w:t>
-      </w:r>
-      <w:proofErr w:type="spellStart"/>
-      <w:r>
-        <w:t>taw</w:t>
-      </w:r>
-      <w:proofErr w:type="spellEnd"/>
-      <w:r>
-        <w:t xml:space="preserve"> </w:t>
-      </w:r>
-      <w:proofErr w:type="spellStart"/>
-      <w:r>
-        <w:t>group</w:t>
-      </w:r>
-      <w:proofErr w:type="spellEnd"/>
-      <w:r>
-        <w:t xml:space="preserve"> </w:t>
-      </w:r>
-      <w:proofErr w:type="spellStart"/>
-      <w:r>
-        <w:t>collapse</w:t>
-      </w:r>
-      <w:proofErr w:type="spellEnd"/>
-    </w:p>
-    <w:p/>
-    <w:p>
-      <w:r>
-        <w:t xml:space="preserve">Talente gruppieren. Stufe 2 erfordert stufe 1. </w:t>
-      </w:r>
-    </w:p>
-    <w:p/>
-    <w:p>
-      <w:proofErr w:type="spellStart"/>
-      <w:r>
-        <w:t>hovertext</w:t>
-      </w:r>
-      <w:proofErr w:type="spellEnd"/>
-      <w:r>
-        <w:t>:</w:t>
-      </w:r>
-      <w:r>
-        <w:br/>
-      </w:r>
-      <w:proofErr w:type="spellStart"/>
-      <w:r>
-        <w:t>eigenschaften</w:t>
-      </w:r>
-      <w:proofErr w:type="spellEnd"/>
-      <w:r>
-        <w:t xml:space="preserve">: </w:t>
-      </w:r>
-      <w:r>
-        <w:br/>
-      </w:r>
-      <w:proofErr w:type="spellStart"/>
-      <w:r>
-        <w:t>eigenschaftsbeschreibung</w:t>
-      </w:r>
-      <w:proofErr w:type="spellEnd"/>
-      <w:r>
-        <w:t xml:space="preserve"> (wenn nicht vorhanden, entwickeln, platzalter „</w:t>
-      </w:r>
-      <w:proofErr w:type="spellStart"/>
-      <w:r>
-        <w:t>eigenschaftstext</w:t>
-      </w:r>
-      <w:proofErr w:type="spellEnd"/>
-      <w:r>
-        <w:t>“)</w:t>
-      </w:r>
-      <w:r>
-        <w:br/>
-      </w:r>
-      <w:proofErr w:type="spellStart"/>
-      <w:r>
-        <w:t>eigenschaften</w:t>
-      </w:r>
-      <w:proofErr w:type="spellEnd"/>
-      <w:r>
-        <w:t xml:space="preserve"> + &amp; - </w:t>
-      </w:r>
-      <w:proofErr w:type="spellStart"/>
-      <w:r>
-        <w:t>buttons</w:t>
-      </w:r>
-      <w:proofErr w:type="spellEnd"/>
-      <w:r>
-        <w:t>:</w:t>
-      </w:r>
-      <w:r>
-        <w:br/>
-      </w:r>
-      <w:r>
-        <w:t xml:space="preserve">alle </w:t>
-      </w:r>
-      <w:proofErr w:type="spellStart"/>
-      <w:r>
-        <w:t>formeln</w:t>
-      </w:r>
-      <w:proofErr w:type="spellEnd"/>
-      <w:r>
-        <w:t xml:space="preserve">, </w:t>
-      </w:r>
-      <w:r>
-        <w:t xml:space="preserve">in denen die </w:t>
-      </w:r>
-      <w:proofErr w:type="spellStart"/>
-      <w:r>
-        <w:t>eigenschaft</w:t>
-      </w:r>
-      <w:proofErr w:type="spellEnd"/>
-      <w:r>
-        <w:t xml:space="preserve"> vorkommt. Fettgedruckt die, wo der nächste punkt eine </w:t>
-      </w:r>
-      <w:proofErr w:type="spellStart"/>
-      <w:r>
-        <w:t>veränderung</w:t>
-      </w:r>
-      <w:proofErr w:type="spellEnd"/>
-      <w:r>
-        <w:t xml:space="preserve"> verursachen würde, inkl. Wert. </w:t>
-      </w:r>
-      <w:r>
-        <w:br/>
-      </w:r>
-      <w:proofErr w:type="spellStart"/>
-      <w:r>
-        <w:t>attribute</w:t>
-      </w:r>
-      <w:proofErr w:type="spellEnd"/>
-      <w:r>
-        <w:t>:</w:t>
-      </w:r>
-      <w:r>
-        <w:br/>
-        <w:t xml:space="preserve">wie </w:t>
-      </w:r>
-      <w:proofErr w:type="spellStart"/>
-      <w:r>
-        <w:t>eigenschaften</w:t>
-      </w:r>
-      <w:proofErr w:type="spellEnd"/>
-      <w:r>
-        <w:br/>
-      </w:r>
-      <w:r>
-        <w:br/>
-      </w:r>
-    </w:p>
-    <w:p>
-      <w:r>
-        <w:t xml:space="preserve">Vor- und </w:t>
-      </w:r>
-      <w:proofErr w:type="spellStart"/>
-      <w:r>
-        <w:t>nachteile</w:t>
-      </w:r>
-      <w:proofErr w:type="spellEnd"/>
-      <w:r>
-        <w:t xml:space="preserve">: </w:t>
-      </w:r>
-      <w:proofErr w:type="spellStart"/>
-      <w:r>
-        <w:t>wirkung</w:t>
-      </w:r>
-      <w:proofErr w:type="spellEnd"/>
-      <w:r>
-        <w:t xml:space="preserve"> einpflegen, </w:t>
-      </w:r>
-      <w:proofErr w:type="spellStart"/>
-      <w:r>
-        <w:t>split</w:t>
-      </w:r>
-      <w:proofErr w:type="spellEnd"/>
-      <w:r>
-        <w:t xml:space="preserve"> nach </w:t>
-      </w:r>
-      <w:proofErr w:type="spellStart"/>
-      <w:r>
-        <w:t>kampfmodul</w:t>
-      </w:r>
-      <w:proofErr w:type="spellEnd"/>
-      <w:r>
-        <w:t xml:space="preserve"> und </w:t>
-      </w:r>
-      <w:proofErr w:type="spellStart"/>
-      <w:r>
-        <w:t>permanenz</w:t>
-      </w:r>
-      <w:proofErr w:type="spellEnd"/>
-      <w:r>
-        <w:t xml:space="preserve">. </w:t>
-      </w:r>
-      <w:r>
-        <w:br/>
-      </w:r>
-      <w:r>
-        <w:t xml:space="preserve">Talente: </w:t>
-      </w:r>
-      <w:proofErr w:type="spellStart"/>
-      <w:r>
-        <w:t>wirkung</w:t>
-      </w:r>
-      <w:proofErr w:type="spellEnd"/>
-      <w:r>
-        <w:t xml:space="preserve"> einpflegen</w:t>
-      </w:r>
-      <w:r>
-        <w:br/>
-        <w:t xml:space="preserve">Rüstungsmodul fertig bauen. </w:t>
-      </w:r>
-      <w:r>
-        <w:br/>
-        <w:t>NK Waffenmodul fertig bauen.</w:t>
-      </w:r>
-      <w:r>
-        <w:br/>
-      </w:r>
-    </w:p>
-    <w:p/>
-    <w:p>
-      <w:r>
-        <w:t>Preisliste WHK Pflanzenkunde -&gt; Alchemistische Zutaten : Alles umbenennen</w:t>
-      </w:r>
-    </w:p>
-    <w:p/>
-    <w:p>
-      <w:r>
-        <w:t xml:space="preserve">NK Waffentabelle: </w:t>
-      </w:r>
-      <w:r>
-        <w:br/>
-      </w:r>
-      <w:r>
-        <w:t xml:space="preserve">  </w:t>
-      </w:r>
+      <w:pPr>
+        <w:rPr>
+          <w:u w:val="single"/>
+        </w:rPr>
+      </w:pPr>
+      <w:r>
+        <w:t xml:space="preserve">Bögen: </w:t>
+      </w:r>
+      <w:r>
+        <w:br/>
+      </w:r>
+      <w:r>
+        <w:rPr>
+          <w:u w:val="single"/>
+        </w:rPr>
+        <w:t xml:space="preserve">Erklärungen: </w:t>
+      </w:r>
+    </w:p>
+    <w:p>
       <w:r>
         <w:rPr>
           <w:b/>
-          <w:bCs/>
+          <w:u w:val="single"/>
         </w:rPr>
-        <w:t>Armklingen elfisch</w:t>
-      </w:r>
-    </w:p>
-    <w:p>
-      <w:pPr>
+        <w:t>RW:</w:t>
+      </w:r>
+      <w:r>
+        <w:t xml:space="preserve"> Im Gegensatz zu Feuerwaffen verlieren Bögen auf großer Entfernung keine TP. </w:t>
+      </w:r>
+      <w:r>
+        <w:t>Die RW dient nur zur Ermittlung der tatsächlichen Flugweite.</w:t>
+      </w:r>
+    </w:p>
+    <w:p>
+      <w:r>
+        <w:tab/>
+        <w:t xml:space="preserve">Diese wird errechnet durch: (RW * TP)m. So erzielt man zum Beispiel mit einem Froggler-Bogen (W6) und einem Eisenspitzen-Pfeil (+W8) 9TP; und </w:t>
+      </w:r>
+      <w:r>
+        <w:tab/>
+        <w:t>der Bogen hat eine RW von 27m; dann fliegt der Pfeil max. 243m weit</w:t>
+      </w:r>
+      <w:r>
+        <w:t>.</w:t>
+      </w:r>
+    </w:p>
+    <w:p>
+      <w:r>
+        <w:t xml:space="preserve">Echter Widerspruch. Der Beispielbogen Froggler hat auf über 200m keine gültige erschwerung. </w:t>
+      </w:r>
+      <w:r>
+        <w:br/>
+      </w:r>
+      <w:r>
+        <w:br/>
+      </w:r>
+      <w:r>
+        <w:t>Fernkampfwaffen: brauchen die ids, um add nk waffen stats und auto-add to nk-waffen?</w:t>
+      </w:r>
+    </w:p>
+    <w:p/>
+    <w:p>
+      <w:r>
+        <w:t xml:space="preserve">vor- und nachteile: </w:t>
+      </w:r>
+      <w:r>
+        <w:t>referenzen überarbeite</w:t>
+      </w:r>
+      <w:r>
+        <w:t>n für ängste und anfälligkeiten</w:t>
+      </w:r>
+      <w:r>
+        <w:t>. Nur 1 pick pro gruppe</w:t>
+      </w:r>
+      <w:r>
+        <w:br/>
+      </w:r>
+      <w:r>
+        <w:br/>
+      </w:r>
+      <w:r>
+        <w:br/>
+      </w:r>
+    </w:p>
+    <w:p>
+      <w:r>
+        <w:t xml:space="preserve">Talente gruppieren. Stufe 2 erfordert stufe 1. </w:t>
+      </w:r>
+    </w:p>
+    <w:p>
+      <w:r>
+        <w:t>sprache &amp; kultur: Description ausweiten mit Kultur und sprache. Gruppieren nach spezies</w:t>
+      </w:r>
+    </w:p>
+    <w:p>
+      <w:r>
+        <w:t>WHK: move feline hieroglyphen to ssk</w:t>
+      </w:r>
+    </w:p>
+    <w:p>
+      <w:r>
+        <w:t>tooltips</w:t>
+      </w:r>
+      <w:r>
+        <w:t>:</w:t>
+      </w:r>
+      <w:r>
+        <w:br/>
+        <w:t xml:space="preserve">eigenschaften: </w:t>
+      </w:r>
+      <w:r>
+        <w:br/>
+        <w:t>eigenschaftsbeschreibung (wenn nicht vorhanden, entwickeln, platzalter „eigenschaftstext“)</w:t>
+      </w:r>
+      <w:r>
+        <w:br/>
+      </w:r>
+      <w:r>
+        <w:t>+ &amp; - buttons:</w:t>
+      </w:r>
+      <w:r>
+        <w:br/>
+      </w:r>
+      <w:r>
+        <w:t xml:space="preserve">alle formeln, </w:t>
+      </w:r>
+      <w:r>
+        <w:t xml:space="preserve">in denen die eigenschaft vorkommt. Fettgedruckt die, wo der nächste punkt eine veränderung verursachen würde, inkl. Wert. </w:t>
+      </w:r>
+      <w:r>
+        <w:br/>
+        <w:t>attribute:</w:t>
+      </w:r>
+      <w:r>
+        <w:t xml:space="preserve"> </w:t>
+      </w:r>
+      <w:r>
+        <w:t>wie eigenschaften</w:t>
+      </w:r>
+      <w:r>
+        <w:br/>
+      </w:r>
+      <w:r>
+        <w:t>SF: Beschreibung</w:t>
+      </w:r>
+      <w:r>
+        <w:br/>
+        <w:t>GF: Beschreibung</w:t>
+      </w:r>
+      <w:r>
+        <w:br/>
+      </w:r>
+      <w:r>
+        <w:t xml:space="preserve">sprache &amp; kultur: worddokumente prüfen nach hovertext. </w:t>
+      </w:r>
+    </w:p>
+    <w:p>
+      <w:r>
+        <w:t>Vor- und nachteile: wirkung</w:t>
+      </w:r>
+      <w:r>
+        <w:t xml:space="preserve"> anzeigen, nicht sp</w:t>
+      </w:r>
+      <w:r>
+        <w:br/>
+      </w:r>
+      <w:r>
+        <w:t xml:space="preserve">Talente: wirkung </w:t>
+      </w:r>
+      <w:r>
+        <w:t>anzeigen, nicht tap</w:t>
+      </w:r>
+      <w:r>
+        <w:br/>
+        <w:t xml:space="preserve">Rüstungsmodul fertig bauen. </w:t>
+      </w:r>
+      <w:r>
+        <w:br/>
+        <w:t>NK Waffenmodul fertig bauen.</w:t>
+      </w:r>
+      <w:r>
+        <w:br/>
+      </w:r>
+    </w:p>
+    <w:p>
+      <w:r>
+        <w:lastRenderedPageBreak/>
+        <w:t xml:space="preserve">Ammo: </w:t>
+      </w:r>
+    </w:p>
+    <w:p>
+      <w:r>
+        <w:t xml:space="preserve">Preisliste </w:t>
+      </w:r>
+      <w:r>
+        <w:t xml:space="preserve">verfügbarkeiten </w:t>
+      </w:r>
+    </w:p>
+    <w:p>
+      <w:r>
+        <w:t xml:space="preserve">Kriminalität: add region + volk + </w:t>
+      </w:r>
+    </w:p>
+    <w:p>
+      <w:r>
+        <w:t>Bewegung: Werte auf meisterscreen s3</w:t>
+      </w:r>
+    </w:p>
+    <w:p>
+      <w:r>
+        <w:t xml:space="preserve">Leiter steigen schnell </w:t>
+      </w:r>
+    </w:p>
+    <w:p>
+      <w:r>
+        <w:t xml:space="preserve">Seil hochklettern </w:t>
+      </w:r>
+    </w:p>
+    <w:p>
+      <w:r>
+        <w:t>Lesegeschwindigkeit (Wörter/min)</w:t>
+      </w:r>
+    </w:p>
+    <w:p/>
+    <w:p>
+      <w:r>
+        <w:t>Kampf: hide leberschutz bis val&gt;0</w:t>
+      </w:r>
+    </w:p>
+    <w:p>
+      <w:r>
+        <w:t>Reittiere entwickeln für Reitgeschwindigkeit</w:t>
+      </w:r>
+    </w:p>
+    <w:p/>
+    <w:p>
+      <w:r>
+        <w:t xml:space="preserve">Regionen: Wirtschaft hinzufügen, wleche materialien sind prävalent und günstiger, was ist selten und teurer? Was sind die Haupt-Handelsrouten? </w:t>
+      </w:r>
+    </w:p>
+    <w:p/>
+    <w:p>
+      <w:r>
+        <w:t xml:space="preserve">Fernkampf: </w:t>
+      </w:r>
+      <w:r>
+        <w:br/>
+        <w:t>Group</w:t>
+      </w:r>
+    </w:p>
+    <w:p/>
+    <w:p>
+      <w:r>
+        <w:t>Nahkampf: nAT/nPA valid pool ziele</w:t>
+      </w:r>
+      <w:r>
+        <w:t>. Jede Waffenzeile hat den vollen Pool zur verteilung.</w:t>
+      </w:r>
+      <w:r>
+        <w:br/>
+        <w:t>was passiert wenn min Stä nicht erfüllt</w:t>
+      </w:r>
+    </w:p>
+    <w:p/>
+    <w:p>
+      <w:r>
+        <w:t>Charakterwerte: hide startbudget</w:t>
+      </w:r>
+      <w:r>
+        <w:t>, startbudget gehoben</w:t>
+      </w:r>
+      <w:r>
+        <w:t>, LE, Gesundheit, stufe, kreis, tap, macht, rerolls, mana, selbstbeherrschung</w:t>
+      </w:r>
+      <w:r>
+        <w:br/>
+      </w:r>
+    </w:p>
+    <w:p>
+      <w:pPr>
+        <w:pStyle w:val="Listenabsatz"/>
         <w:numPr>
-          <w:ilvl w:val="0"/>
+          <w:ilvl w:val="1"/>
           <w:numId w:val="1"/>
         </w:numPr>
       </w:pPr>
       <w:r>
-        <w:t>Unbewaffnet → Armklingen</w:t>
-      </w:r>
-    </w:p>
-    <w:p>
-      <w:pPr>
+        <w:t>Create s02, show values, rs, equipped weapons and final proben</w:t>
+      </w:r>
+      <w:r>
+        <w:br/>
+        <w:t>- creat magie tab, migrate magie values</w:t>
+      </w:r>
+      <w:r>
+        <w:br/>
+        <w:t>- create KI tab, migrate KI values</w:t>
+      </w:r>
+    </w:p>
+    <w:p>
+      <w:pPr>
+        <w:pStyle w:val="Listenabsatz"/>
         <w:numPr>
-          <w:ilvl w:val="0"/>
+          <w:ilvl w:val="1"/>
           <w:numId w:val="1"/>
         </w:numPr>
       </w:pPr>
       <w:r>
-        <w:t xml:space="preserve">REMOVE </w:t>
-      </w:r>
-      <w:r>
-        <w:t>Stichwaffen → Fechtwaffen</w:t>
-      </w:r>
-    </w:p>
-    <w:p>
-      <w:r>
-        <w:lastRenderedPageBreak/>
-        <w:t xml:space="preserve">  </w:t>
-      </w:r>
-      <w:proofErr w:type="spellStart"/>
-      <w:r>
-        <w:rPr>
-          <w:b/>
-          <w:bCs/>
-        </w:rPr>
-        <w:t>Bat’leth</w:t>
-      </w:r>
-      <w:proofErr w:type="spellEnd"/>
-      <w:r>
-        <w:rPr>
-          <w:b/>
-          <w:bCs/>
-        </w:rPr>
-        <w:t xml:space="preserve"> </w:t>
-      </w:r>
-      <w:proofErr w:type="spellStart"/>
-      <w:r>
-        <w:rPr>
-          <w:b/>
-          <w:bCs/>
-        </w:rPr>
-        <w:t>orkisch</w:t>
-      </w:r>
-      <w:proofErr w:type="spellEnd"/>
-    </w:p>
-    <w:p>
-      <w:pPr>
-        <w:numPr>
-          <w:ilvl w:val="0"/>
-          <w:numId w:val="2"/>
-        </w:numPr>
-      </w:pPr>
-      <w:r>
-        <w:t xml:space="preserve">REMOVE </w:t>
-      </w:r>
-      <w:r>
-        <w:t>Stangenwaffen → Stäbe</w:t>
-      </w:r>
-    </w:p>
-    <w:p>
-      <w:pPr>
-        <w:numPr>
-          <w:ilvl w:val="0"/>
-          <w:numId w:val="2"/>
-        </w:numPr>
-      </w:pPr>
-      <w:r>
-        <w:t>Klingenwaffen → Zweihänder</w:t>
-      </w:r>
-    </w:p>
-    <w:p/>
-    <w:p/>
-    <w:p/>
-    <w:p>
-      <w:r>
-        <w:t xml:space="preserve">Regionen: Wirtschaft hinzufügen, </w:t>
-      </w:r>
-      <w:proofErr w:type="spellStart"/>
-      <w:r>
-        <w:t>wleche</w:t>
-      </w:r>
-      <w:proofErr w:type="spellEnd"/>
-      <w:r>
-        <w:t xml:space="preserve"> </w:t>
-      </w:r>
-      <w:proofErr w:type="spellStart"/>
-      <w:r>
-        <w:t>materialien</w:t>
-      </w:r>
-      <w:proofErr w:type="spellEnd"/>
-      <w:r>
-        <w:t xml:space="preserve"> sind prävalent und günstiger, was ist selten und teurer? Was sind die Haupt-Handelsrouten? </w:t>
+        <w:t>Create PSI tab, migrate psi values</w:t>
       </w:r>
     </w:p>
     <w:sectPr>
@@ -516,7 +328,7 @@
   <w:abstractNum w:abstractNumId="0" w15:restartNumberingAfterBreak="0">
     <w:nsid w:val="094D79B9"/>
     <w:multiLevelType w:val="multilevel"/>
-    <w:tmpl w:val="EA44BE3C"/>
+    <w:tmpl w:val="01C4232A"/>
     <w:lvl w:ilvl="0">
       <w:start w:val="1"/>
       <w:numFmt w:val="bullet"/>
@@ -533,20 +345,15 @@
         <w:sz w:val="20"/>
       </w:rPr>
     </w:lvl>
-    <w:lvl w:ilvl="1" w:tentative="1">
-      <w:start w:val="1"/>
-      <w:numFmt w:val="bullet"/>
-      <w:lvlText w:val="o"/>
-      <w:lvlJc w:val="left"/>
-      <w:pPr>
-        <w:tabs>
-          <w:tab w:val="num" w:pos="1440"/>
-        </w:tabs>
+    <w:lvl w:ilvl="1">
+      <w:numFmt w:val="bullet"/>
+      <w:lvlText w:val="-"/>
+      <w:lvlJc w:val="left"/>
+      <w:pPr>
         <w:ind w:left="1440" w:hanging="360"/>
       </w:pPr>
       <w:rPr>
-        <w:rFonts w:ascii="Courier New" w:hAnsi="Courier New" w:hint="default"/>
-        <w:sz w:val="20"/>
+        <w:rFonts w:ascii="Aptos" w:eastAsiaTheme="minorHAnsi" w:hAnsi="Aptos" w:cstheme="minorBidi" w:hint="default"/>
       </w:rPr>
     </w:lvl>
     <w:lvl w:ilvl="2" w:tentative="1">
@@ -811,11 +618,126 @@
       </w:rPr>
     </w:lvl>
   </w:abstractNum>
+  <w:abstractNum w:abstractNumId="2" w15:restartNumberingAfterBreak="0">
+    <w:nsid w:val="3F266814"/>
+    <w:multiLevelType w:val="hybridMultilevel"/>
+    <w:tmpl w:val="ABF66D72"/>
+    <w:lvl w:ilvl="0" w:tplc="3738A808">
+      <w:numFmt w:val="bullet"/>
+      <w:lvlText w:val="-"/>
+      <w:lvlJc w:val="left"/>
+      <w:pPr>
+        <w:ind w:left="720" w:hanging="360"/>
+      </w:pPr>
+      <w:rPr>
+        <w:rFonts w:ascii="Aptos" w:eastAsiaTheme="minorHAnsi" w:hAnsi="Aptos" w:cstheme="minorBidi" w:hint="default"/>
+      </w:rPr>
+    </w:lvl>
+    <w:lvl w:ilvl="1" w:tplc="04070003" w:tentative="1">
+      <w:start w:val="1"/>
+      <w:numFmt w:val="bullet"/>
+      <w:lvlText w:val="o"/>
+      <w:lvlJc w:val="left"/>
+      <w:pPr>
+        <w:ind w:left="1440" w:hanging="360"/>
+      </w:pPr>
+      <w:rPr>
+        <w:rFonts w:ascii="Courier New" w:hAnsi="Courier New" w:cs="Courier New" w:hint="default"/>
+      </w:rPr>
+    </w:lvl>
+    <w:lvl w:ilvl="2" w:tplc="04070005" w:tentative="1">
+      <w:start w:val="1"/>
+      <w:numFmt w:val="bullet"/>
+      <w:lvlText w:val=""/>
+      <w:lvlJc w:val="left"/>
+      <w:pPr>
+        <w:ind w:left="2160" w:hanging="360"/>
+      </w:pPr>
+      <w:rPr>
+        <w:rFonts w:ascii="Wingdings" w:hAnsi="Wingdings" w:hint="default"/>
+      </w:rPr>
+    </w:lvl>
+    <w:lvl w:ilvl="3" w:tplc="04070001" w:tentative="1">
+      <w:start w:val="1"/>
+      <w:numFmt w:val="bullet"/>
+      <w:lvlText w:val=""/>
+      <w:lvlJc w:val="left"/>
+      <w:pPr>
+        <w:ind w:left="2880" w:hanging="360"/>
+      </w:pPr>
+      <w:rPr>
+        <w:rFonts w:ascii="Symbol" w:hAnsi="Symbol" w:hint="default"/>
+      </w:rPr>
+    </w:lvl>
+    <w:lvl w:ilvl="4" w:tplc="04070003" w:tentative="1">
+      <w:start w:val="1"/>
+      <w:numFmt w:val="bullet"/>
+      <w:lvlText w:val="o"/>
+      <w:lvlJc w:val="left"/>
+      <w:pPr>
+        <w:ind w:left="3600" w:hanging="360"/>
+      </w:pPr>
+      <w:rPr>
+        <w:rFonts w:ascii="Courier New" w:hAnsi="Courier New" w:cs="Courier New" w:hint="default"/>
+      </w:rPr>
+    </w:lvl>
+    <w:lvl w:ilvl="5" w:tplc="04070005" w:tentative="1">
+      <w:start w:val="1"/>
+      <w:numFmt w:val="bullet"/>
+      <w:lvlText w:val=""/>
+      <w:lvlJc w:val="left"/>
+      <w:pPr>
+        <w:ind w:left="4320" w:hanging="360"/>
+      </w:pPr>
+      <w:rPr>
+        <w:rFonts w:ascii="Wingdings" w:hAnsi="Wingdings" w:hint="default"/>
+      </w:rPr>
+    </w:lvl>
+    <w:lvl w:ilvl="6" w:tplc="04070001" w:tentative="1">
+      <w:start w:val="1"/>
+      <w:numFmt w:val="bullet"/>
+      <w:lvlText w:val=""/>
+      <w:lvlJc w:val="left"/>
+      <w:pPr>
+        <w:ind w:left="5040" w:hanging="360"/>
+      </w:pPr>
+      <w:rPr>
+        <w:rFonts w:ascii="Symbol" w:hAnsi="Symbol" w:hint="default"/>
+      </w:rPr>
+    </w:lvl>
+    <w:lvl w:ilvl="7" w:tplc="04070003" w:tentative="1">
+      <w:start w:val="1"/>
+      <w:numFmt w:val="bullet"/>
+      <w:lvlText w:val="o"/>
+      <w:lvlJc w:val="left"/>
+      <w:pPr>
+        <w:ind w:left="5760" w:hanging="360"/>
+      </w:pPr>
+      <w:rPr>
+        <w:rFonts w:ascii="Courier New" w:hAnsi="Courier New" w:cs="Courier New" w:hint="default"/>
+      </w:rPr>
+    </w:lvl>
+    <w:lvl w:ilvl="8" w:tplc="04070005" w:tentative="1">
+      <w:start w:val="1"/>
+      <w:numFmt w:val="bullet"/>
+      <w:lvlText w:val=""/>
+      <w:lvlJc w:val="left"/>
+      <w:pPr>
+        <w:ind w:left="6480" w:hanging="360"/>
+      </w:pPr>
+      <w:rPr>
+        <w:rFonts w:ascii="Wingdings" w:hAnsi="Wingdings" w:hint="default"/>
+      </w:rPr>
+    </w:lvl>
+  </w:abstractNum>
   <w:num w:numId="1" w16cid:durableId="1249341751">
     <w:abstractNumId w:val="0"/>
   </w:num>
   <w:num w:numId="2" w16cid:durableId="746879432">
     <w:abstractNumId w:val="1"/>
+  </w:num>
+  <w:num w:numId="3" w16cid:durableId="2020236267">
+    <w:abstractNumId w:val="2"/>
   </w:num>
 </w:numbering>
 </file>
@@ -1423,6 +1345,7 @@
   <w:style w:type="character" w:default="1" w:styleId="Absatz-Standardschriftart">
     <w:name w:val="Default Paragraph Font"/>
     <w:uiPriority w:val="1"/>
+    <w:semiHidden/>
     <w:unhideWhenUsed/>
   </w:style>
   <w:style w:type="table" w:default="1" w:styleId="NormaleTabelle">

</xml_diff>